<commit_message>
updated info for AY 2025-26
</commit_message>
<xml_diff>
--- a/guides/information_about_the_examination_modality.docx
+++ b/guides/information_about_the_examination_modality.docx
@@ -417,50 +417,57 @@
         <w:rPr>
           <w:rFonts w:ascii="Aptos" w:hAnsi="Aptos"/>
         </w:rPr>
-        <w:t xml:space="preserve"> consists of a mix of open and closed questions</w:t>
-      </w:r>
-      <w:r>
-        <w:rPr>
-          <w:rFonts w:ascii="Aptos" w:hAnsi="Aptos"/>
-        </w:rPr>
-        <w:t xml:space="preserve">: up to 3 open questions + 15 closed questions. </w:t>
-      </w:r>
-    </w:p>
-    <w:p>
-      <w:pPr>
-        <w:rPr>
-          <w:rFonts w:ascii="Aptos" w:hAnsi="Aptos"/>
-        </w:rPr>
-      </w:pPr>
-      <w:r>
-        <w:rPr>
-          <w:rFonts w:ascii="Aptos" w:hAnsi="Aptos"/>
-        </w:rPr>
-        <w:t xml:space="preserve">The questions will focus </w:t>
-      </w:r>
-      <w:r>
-        <w:rPr>
-          <w:rFonts w:ascii="Aptos" w:hAnsi="Aptos"/>
-        </w:rPr>
-        <w:t xml:space="preserve">only </w:t>
-      </w:r>
-      <w:r>
-        <w:rPr>
-          <w:rFonts w:ascii="Aptos" w:hAnsi="Aptos"/>
-        </w:rPr>
-        <w:t xml:space="preserve">on the course content that will be </w:t>
-      </w:r>
-      <w:r>
-        <w:rPr>
-          <w:rFonts w:ascii="Aptos" w:hAnsi="Aptos"/>
-        </w:rPr>
-        <w:t>presented</w:t>
-      </w:r>
-      <w:r>
-        <w:rPr>
-          <w:rFonts w:ascii="Aptos" w:hAnsi="Aptos"/>
-        </w:rPr>
-        <w:t xml:space="preserve"> during the “theory” lessons. </w:t>
+        <w:t xml:space="preserve"> consists of </w:t>
+      </w:r>
+      <w:r>
+        <w:rPr>
+          <w:rFonts w:ascii="Aptos" w:hAnsi="Aptos"/>
+        </w:rPr>
+        <w:t>four</w:t>
+      </w:r>
+      <w:r>
+        <w:rPr>
+          <w:rFonts w:ascii="Aptos" w:hAnsi="Aptos"/>
+        </w:rPr>
+        <w:t xml:space="preserve"> open questions</w:t>
+      </w:r>
+      <w:r>
+        <w:rPr>
+          <w:rFonts w:ascii="Aptos" w:hAnsi="Aptos"/>
+        </w:rPr>
+        <w:t>.</w:t>
+      </w:r>
+    </w:p>
+    <w:p>
+      <w:pPr>
+        <w:rPr>
+          <w:rFonts w:ascii="Aptos" w:hAnsi="Aptos"/>
+        </w:rPr>
+      </w:pPr>
+      <w:r>
+        <w:rPr>
+          <w:rFonts w:ascii="Aptos" w:hAnsi="Aptos"/>
+        </w:rPr>
+        <w:t xml:space="preserve"> </w:t>
+      </w:r>
+    </w:p>
+    <w:p>
+      <w:pPr>
+        <w:rPr>
+          <w:rFonts w:ascii="Aptos" w:hAnsi="Aptos"/>
+        </w:rPr>
+      </w:pPr>
+      <w:r>
+        <w:rPr>
+          <w:rFonts w:ascii="Aptos" w:hAnsi="Aptos"/>
+        </w:rPr>
+        <w:t>The questions will focus on the course content</w:t>
+      </w:r>
+      <w:r>
+        <w:rPr>
+          <w:rFonts w:ascii="Aptos" w:hAnsi="Aptos"/>
+        </w:rPr>
+        <w:t xml:space="preserve"> presented during both the “theory” and the “laboratory” lessons. In any case, no questions will require to write Dart/Flutter code. </w:t>
       </w:r>
     </w:p>
     <w:p>
@@ -556,13 +563,7 @@
         <w:rPr>
           <w:rFonts w:ascii="Aptos" w:hAnsi="Aptos"/>
         </w:rPr>
-        <w:t xml:space="preserve">You take the first exam attempt and you get 16/20. You decide to try the second attempt to improve the result. You get 18/20. </w:t>
-      </w:r>
-      <w:r>
-        <w:rPr>
-          <w:rFonts w:ascii="Aptos" w:hAnsi="Aptos"/>
-        </w:rPr>
-        <w:t>18/20 will be considered as the written exam grade.</w:t>
+        <w:t>You take the first exam attempt and you get 16/20. You decide to try the second attempt to improve the result. You get 18/20. 18/20 will be considered as the written exam grade.</w:t>
       </w:r>
     </w:p>
     <w:p>
@@ -580,31 +581,7 @@
         <w:rPr>
           <w:rFonts w:ascii="Aptos" w:hAnsi="Aptos"/>
         </w:rPr>
-        <w:t>You take the first exam attempt and you get 16/20. You decide to try the second attempt to improve the result. You get 1</w:t>
-      </w:r>
-      <w:r>
-        <w:rPr>
-          <w:rFonts w:ascii="Aptos" w:hAnsi="Aptos"/>
-        </w:rPr>
-        <w:t>3</w:t>
-      </w:r>
-      <w:r>
-        <w:rPr>
-          <w:rFonts w:ascii="Aptos" w:hAnsi="Aptos"/>
-        </w:rPr>
-        <w:t>/20. 1</w:t>
-      </w:r>
-      <w:r>
-        <w:rPr>
-          <w:rFonts w:ascii="Aptos" w:hAnsi="Aptos"/>
-        </w:rPr>
-        <w:t>3</w:t>
-      </w:r>
-      <w:r>
-        <w:rPr>
-          <w:rFonts w:ascii="Aptos" w:hAnsi="Aptos"/>
-        </w:rPr>
-        <w:t>/20 will be considered as the written exam grade.</w:t>
+        <w:t>You take the first exam attempt and you get 16/20. You decide to try the second attempt to improve the result. You get 13/20. 13/20 will be considered as the written exam grade.</w:t>
       </w:r>
     </w:p>
     <w:p>
@@ -622,31 +599,14 @@
         <w:rPr>
           <w:rFonts w:ascii="Aptos" w:hAnsi="Aptos"/>
         </w:rPr>
-        <w:t xml:space="preserve">You take the first exam attempt and you get 16/20. You decide to try the second attempt to improve the result. </w:t>
-      </w:r>
-      <w:r>
-        <w:rPr>
-          <w:rFonts w:ascii="Aptos" w:hAnsi="Aptos"/>
-        </w:rPr>
-        <w:t>At the exam, you realize that you do not know the answers and you decide to withdraw. 16</w:t>
-      </w:r>
-      <w:r>
-        <w:rPr>
-          <w:rFonts w:ascii="Aptos" w:hAnsi="Aptos"/>
-        </w:rPr>
-        <w:t>/20 will be</w:t>
-      </w:r>
-      <w:r>
-        <w:rPr>
-          <w:rFonts w:ascii="Aptos" w:hAnsi="Aptos"/>
-        </w:rPr>
-        <w:t xml:space="preserve"> still</w:t>
-      </w:r>
-      <w:r>
-        <w:rPr>
-          <w:rFonts w:ascii="Aptos" w:hAnsi="Aptos"/>
-        </w:rPr>
-        <w:t xml:space="preserve"> considered as the written exam grade.</w:t>
+        <w:t xml:space="preserve">You take the first exam attempt and you get 16/20. You decide to try the second attempt to improve the result. At the exam, you realize that you do not know the </w:t>
+      </w:r>
+      <w:r>
+        <w:rPr>
+          <w:rFonts w:ascii="Aptos" w:hAnsi="Aptos"/>
+        </w:rPr>
+        <w:lastRenderedPageBreak/>
+        <w:t>answers and you decide to withdraw. 16/20 will be still considered as the written exam grade.</w:t>
       </w:r>
     </w:p>
     <w:p>
@@ -727,13 +687,7 @@
         <w:rPr>
           <w:rFonts w:ascii="Aptos" w:hAnsi="Aptos"/>
         </w:rPr>
-        <w:t>2</w:t>
-      </w:r>
-      <w:r>
-        <w:rPr>
-          <w:rFonts w:ascii="Aptos" w:hAnsi="Aptos"/>
-        </w:rPr>
-        <w:t>7</w:t>
+        <w:t>18</w:t>
       </w:r>
       <w:r>
         <w:rPr>
@@ -745,7 +699,7 @@
         <w:rPr>
           <w:rFonts w:ascii="Aptos" w:hAnsi="Aptos"/>
         </w:rPr>
-        <w:t>5</w:t>
+        <w:t>6</w:t>
       </w:r>
       <w:r>
         <w:rPr>
@@ -765,11 +719,12 @@
         </w:rPr>
         <w:t xml:space="preserve">:00 – Room </w:t>
       </w:r>
-      <w:r>
-        <w:rPr>
-          <w:rFonts w:ascii="Aptos" w:hAnsi="Aptos"/>
-        </w:rPr>
-        <w:t>A</w:t>
+      <w:proofErr w:type="spellStart"/>
+      <w:r>
+        <w:rPr>
+          <w:rFonts w:ascii="Aptos" w:hAnsi="Aptos"/>
+        </w:rPr>
+        <w:t>M</w:t>
       </w:r>
       <w:r>
         <w:rPr>
@@ -777,6 +732,13 @@
         </w:rPr>
         <w:t>e</w:t>
       </w:r>
+      <w:r>
+        <w:rPr>
+          <w:rFonts w:ascii="Aptos" w:hAnsi="Aptos"/>
+        </w:rPr>
+        <w:t>+Ne</w:t>
+      </w:r>
+      <w:proofErr w:type="spellEnd"/>
     </w:p>
     <w:p>
       <w:pPr>
@@ -817,7 +779,7 @@
         <w:rPr>
           <w:rFonts w:ascii="Aptos" w:hAnsi="Aptos"/>
         </w:rPr>
-        <w:t>14</w:t>
+        <w:t>07</w:t>
       </w:r>
       <w:r>
         <w:rPr>
@@ -829,7 +791,7 @@
         <w:rPr>
           <w:rFonts w:ascii="Aptos" w:hAnsi="Aptos"/>
         </w:rPr>
-        <w:t>5</w:t>
+        <w:t>6</w:t>
       </w:r>
       <w:r>
         <w:rPr>
@@ -847,7 +809,19 @@
         <w:rPr>
           <w:rFonts w:ascii="Aptos" w:hAnsi="Aptos"/>
         </w:rPr>
-        <w:t>00 – Room Ae</w:t>
+        <w:t xml:space="preserve">00 – Room </w:t>
+      </w:r>
+      <w:r>
+        <w:rPr>
+          <w:rFonts w:ascii="Aptos" w:hAnsi="Aptos"/>
+        </w:rPr>
+        <w:t>D</w:t>
+      </w:r>
+      <w:r>
+        <w:rPr>
+          <w:rFonts w:ascii="Aptos" w:hAnsi="Aptos"/>
+        </w:rPr>
+        <w:t>e</w:t>
       </w:r>
     </w:p>
     <w:p>
@@ -889,7 +863,13 @@
         <w:rPr>
           <w:rFonts w:ascii="Aptos" w:hAnsi="Aptos"/>
         </w:rPr>
-        <w:t>27</w:t>
+        <w:t>2</w:t>
+      </w:r>
+      <w:r>
+        <w:rPr>
+          <w:rFonts w:ascii="Aptos" w:hAnsi="Aptos"/>
+        </w:rPr>
+        <w:t>8</w:t>
       </w:r>
       <w:r>
         <w:rPr>
@@ -913,7 +893,7 @@
         <w:rPr>
           <w:rFonts w:ascii="Aptos" w:hAnsi="Aptos"/>
         </w:rPr>
-        <w:t>5</w:t>
+        <w:t>6</w:t>
       </w:r>
       <w:r>
         <w:rPr>
@@ -991,7 +971,13 @@
         <w:rPr>
           <w:rFonts w:ascii="Aptos" w:hAnsi="Aptos"/>
         </w:rPr>
-        <w:t>02</w:t>
+        <w:t>0</w:t>
+      </w:r>
+      <w:r>
+        <w:rPr>
+          <w:rFonts w:ascii="Aptos" w:hAnsi="Aptos"/>
+        </w:rPr>
+        <w:t>1</w:t>
       </w:r>
       <w:r>
         <w:rPr>
@@ -1015,7 +1001,7 @@
         <w:rPr>
           <w:rFonts w:ascii="Aptos" w:hAnsi="Aptos"/>
         </w:rPr>
-        <w:t>6</w:t>
+        <w:t>7</w:t>
       </w:r>
       <w:r>
         <w:rPr>
@@ -1063,7 +1049,7 @@
         <w:rPr>
           <w:rFonts w:ascii="Aptos" w:hAnsi="Aptos"/>
         </w:rPr>
-        <w:t>D</w:t>
+        <w:t>E</w:t>
       </w:r>
       <w:r>
         <w:rPr>
@@ -1702,13 +1688,13 @@
         <w:rPr>
           <w:rFonts w:ascii="Aptos" w:hAnsi="Aptos"/>
         </w:rPr>
-        <w:t>5</w:t>
-      </w:r>
-      <w:r>
-        <w:rPr>
-          <w:rFonts w:ascii="Aptos" w:hAnsi="Aptos"/>
-        </w:rPr>
-        <w:t>0%)</w:t>
+        <w:t>40</w:t>
+      </w:r>
+      <w:r>
+        <w:rPr>
+          <w:rFonts w:ascii="Aptos" w:hAnsi="Aptos"/>
+        </w:rPr>
+        <w:t>%)</w:t>
       </w:r>
     </w:p>
     <w:p>
@@ -1756,7 +1742,7 @@
         <w:rPr>
           <w:rFonts w:ascii="Aptos" w:hAnsi="Aptos"/>
         </w:rPr>
-        <w:t>45</w:t>
+        <w:t>50</w:t>
       </w:r>
       <w:r>
         <w:rPr>
@@ -1798,7 +1784,7 @@
         <w:rPr>
           <w:rFonts w:ascii="Aptos" w:hAnsi="Aptos"/>
         </w:rPr>
-        <w:t>5</w:t>
+        <w:t>10</w:t>
       </w:r>
       <w:r>
         <w:rPr>
@@ -1872,7 +1858,7 @@
         <w:rPr>
           <w:rFonts w:ascii="Aptos" w:hAnsi="Aptos"/>
         </w:rPr>
-        <w:t>3</w:t>
+        <w:t>2</w:t>
       </w:r>
       <w:r>
         <w:rPr>
@@ -1896,7 +1882,7 @@
         <w:rPr>
           <w:rFonts w:ascii="Aptos" w:hAnsi="Aptos"/>
         </w:rPr>
-        <w:t>5</w:t>
+        <w:t>6</w:t>
       </w:r>
       <w:r>
         <w:rPr>
@@ -1952,14 +1938,13 @@
         <w:rPr>
           <w:rFonts w:ascii="Aptos" w:hAnsi="Aptos"/>
         </w:rPr>
-        <w:lastRenderedPageBreak/>
         <w:t xml:space="preserve">Window #1: from </w:t>
       </w:r>
       <w:r>
         <w:rPr>
           <w:rFonts w:ascii="Aptos" w:hAnsi="Aptos"/>
         </w:rPr>
-        <w:t>30</w:t>
+        <w:t>15</w:t>
       </w:r>
       <w:r>
         <w:rPr>
@@ -1983,7 +1968,7 @@
         <w:rPr>
           <w:rFonts w:ascii="Aptos" w:hAnsi="Aptos"/>
         </w:rPr>
-        <w:t>5</w:t>
+        <w:t>6</w:t>
       </w:r>
       <w:r>
         <w:rPr>
@@ -1995,7 +1980,7 @@
         <w:rPr>
           <w:rFonts w:ascii="Aptos" w:hAnsi="Aptos"/>
         </w:rPr>
-        <w:t>25</w:t>
+        <w:t>18</w:t>
       </w:r>
       <w:r>
         <w:rPr>
@@ -2007,7 +1992,7 @@
         <w:rPr>
           <w:rFonts w:ascii="Aptos" w:hAnsi="Aptos"/>
         </w:rPr>
-        <w:t>5</w:t>
+        <w:t>6</w:t>
       </w:r>
     </w:p>
     <w:p>
@@ -2031,19 +2016,19 @@
         <w:rPr>
           <w:rFonts w:ascii="Aptos" w:hAnsi="Aptos"/>
         </w:rPr>
-        <w:t>25</w:t>
-      </w:r>
-      <w:r>
-        <w:rPr>
-          <w:rFonts w:ascii="Aptos" w:hAnsi="Aptos"/>
-        </w:rPr>
-        <w:t>/08/202</w:t>
-      </w:r>
-      <w:r>
-        <w:rPr>
-          <w:rFonts w:ascii="Aptos" w:hAnsi="Aptos"/>
-        </w:rPr>
-        <w:t>5</w:t>
+        <w:t>19</w:t>
+      </w:r>
+      <w:r>
+        <w:rPr>
+          <w:rFonts w:ascii="Aptos" w:hAnsi="Aptos"/>
+        </w:rPr>
+        <w:t>/08/20</w:t>
+      </w:r>
+      <w:r>
+        <w:rPr>
+          <w:rFonts w:ascii="Aptos" w:hAnsi="Aptos"/>
+        </w:rPr>
+        <w:t>26</w:t>
       </w:r>
       <w:r>
         <w:rPr>
@@ -2067,7 +2052,7 @@
         <w:rPr>
           <w:rFonts w:ascii="Aptos" w:hAnsi="Aptos"/>
         </w:rPr>
-        <w:t>5</w:t>
+        <w:t>6</w:t>
       </w:r>
     </w:p>
     <w:p>
@@ -2160,7 +2145,7 @@
         <w:rPr>
           <w:rFonts w:ascii="Aptos" w:hAnsi="Aptos"/>
         </w:rPr>
-        <w:t>5</w:t>
+        <w:t>6</w:t>
       </w:r>
       <w:r>
         <w:rPr>
@@ -2202,7 +2187,7 @@
         <w:rPr>
           <w:rFonts w:ascii="Aptos" w:hAnsi="Aptos"/>
         </w:rPr>
-        <w:t>5</w:t>
+        <w:t>6</w:t>
       </w:r>
       <w:r>
         <w:rPr>
@@ -2226,7 +2211,7 @@
         <w:rPr>
           <w:rFonts w:ascii="Aptos" w:hAnsi="Aptos"/>
         </w:rPr>
-        <w:t>5</w:t>
+        <w:t>6</w:t>
       </w:r>
       <w:r>
         <w:rPr>
@@ -2256,7 +2241,7 @@
         <w:rPr>
           <w:rFonts w:ascii="Aptos" w:hAnsi="Aptos"/>
         </w:rPr>
-        <w:t>5</w:t>
+        <w:t>6</w:t>
       </w:r>
       <w:r>
         <w:rPr>
@@ -2268,7 +2253,13 @@
         <w:rPr>
           <w:rFonts w:ascii="Aptos" w:hAnsi="Aptos"/>
         </w:rPr>
-        <w:t>03</w:t>
+        <w:t>0</w:t>
+      </w:r>
+      <w:r>
+        <w:rPr>
+          <w:rFonts w:ascii="Aptos" w:hAnsi="Aptos"/>
+        </w:rPr>
+        <w:t>1</w:t>
       </w:r>
       <w:r>
         <w:rPr>
@@ -2298,7 +2289,7 @@
         <w:rPr>
           <w:rFonts w:ascii="Aptos" w:hAnsi="Aptos"/>
         </w:rPr>
-        <w:t>5</w:t>
+        <w:t>6</w:t>
       </w:r>
       <w:r>
         <w:rPr>
@@ -2322,7 +2313,7 @@
         <w:rPr>
           <w:rFonts w:ascii="Aptos" w:hAnsi="Aptos"/>
         </w:rPr>
-        <w:t>5</w:t>
+        <w:t>6</w:t>
       </w:r>
       <w:r>
         <w:rPr>
@@ -2352,7 +2343,7 @@
         <w:rPr>
           <w:rFonts w:ascii="Aptos" w:hAnsi="Aptos"/>
         </w:rPr>
-        <w:t>3</w:t>
+        <w:t>2</w:t>
       </w:r>
       <w:r>
         <w:rPr>
@@ -2364,19 +2355,19 @@
         <w:rPr>
           <w:rFonts w:ascii="Aptos" w:hAnsi="Aptos"/>
         </w:rPr>
-        <w:t>5</w:t>
-      </w:r>
-      <w:r>
-        <w:rPr>
-          <w:rFonts w:ascii="Aptos" w:hAnsi="Aptos"/>
-        </w:rPr>
-        <w:t>, Project discussion on 2</w:t>
-      </w:r>
-      <w:r>
-        <w:rPr>
-          <w:rFonts w:ascii="Aptos" w:hAnsi="Aptos"/>
-        </w:rPr>
-        <w:t>1</w:t>
+        <w:t>6</w:t>
+      </w:r>
+      <w:r>
+        <w:rPr>
+          <w:rFonts w:ascii="Aptos" w:hAnsi="Aptos"/>
+        </w:rPr>
+        <w:t xml:space="preserve">, Project discussion on </w:t>
+      </w:r>
+      <w:r>
+        <w:rPr>
+          <w:rFonts w:ascii="Aptos" w:hAnsi="Aptos"/>
+        </w:rPr>
+        <w:t>17</w:t>
       </w:r>
       <w:r>
         <w:rPr>
@@ -2400,7 +2391,7 @@
         <w:rPr>
           <w:rFonts w:ascii="Aptos" w:hAnsi="Aptos"/>
         </w:rPr>
-        <w:t>5</w:t>
+        <w:t>6</w:t>
       </w:r>
       <w:r>
         <w:rPr>
@@ -2424,7 +2415,7 @@
         <w:rPr>
           <w:rFonts w:ascii="Aptos" w:hAnsi="Aptos"/>
         </w:rPr>
-        <w:t>5</w:t>
+        <w:t>6</w:t>
       </w:r>
       <w:r>
         <w:rPr>
@@ -2454,7 +2445,7 @@
         <w:rPr>
           <w:rFonts w:ascii="Aptos" w:hAnsi="Aptos"/>
         </w:rPr>
-        <w:t>3</w:t>
+        <w:t>2</w:t>
       </w:r>
       <w:r>
         <w:rPr>
@@ -2466,7 +2457,7 @@
         <w:rPr>
           <w:rFonts w:ascii="Aptos" w:hAnsi="Aptos"/>
         </w:rPr>
-        <w:t>5</w:t>
+        <w:t>6</w:t>
       </w:r>
       <w:r>
         <w:rPr>
@@ -2478,7 +2469,7 @@
         <w:rPr>
           <w:rFonts w:ascii="Aptos" w:hAnsi="Aptos"/>
         </w:rPr>
-        <w:t>5</w:t>
+        <w:t>6</w:t>
       </w:r>
       <w:r>
         <w:rPr>
@@ -2502,7 +2493,7 @@
         <w:rPr>
           <w:rFonts w:ascii="Aptos" w:hAnsi="Aptos"/>
         </w:rPr>
-        <w:t>5</w:t>
+        <w:t>6</w:t>
       </w:r>
       <w:r>
         <w:rPr>
@@ -2754,14 +2745,12 @@
         </w:rPr>
         <w:t xml:space="preserve"> in the third session or </w:t>
       </w:r>
-      <w:proofErr w:type="gramStart"/>
-      <w:r>
-        <w:rPr>
-          <w:rFonts w:ascii="Aptos" w:hAnsi="Aptos"/>
-        </w:rPr>
-        <w:t>you want</w:t>
-      </w:r>
-      <w:proofErr w:type="gramEnd"/>
+      <w:r>
+        <w:rPr>
+          <w:rFonts w:ascii="Aptos" w:hAnsi="Aptos"/>
+        </w:rPr>
+        <w:t>want</w:t>
+      </w:r>
       <w:r>
         <w:rPr>
           <w:rFonts w:ascii="Aptos" w:hAnsi="Aptos"/>
@@ -2979,6 +2968,7 @@
         <w:rPr>
           <w:rFonts w:ascii="Aptos" w:hAnsi="Aptos"/>
         </w:rPr>
+        <w:lastRenderedPageBreak/>
         <w:t xml:space="preserve">If, at the end of the enrollment period, </w:t>
       </w:r>
       <w:r>

</xml_diff>